<commit_message>
Finalise offer letter for Oreoluwa Gbadamosi
Removes all placeholder fields. Engagement now commences on signing,
the probation clause is dropped, working hours are unfixed (with the
Mon/Wed/Fri online meetings still mandatory), and the commission rate
is left to a separate written agreement rather than stated in the
letter. Ordinary notice is two weeks either way; termination for
performance or inactivity keeps the 14-day written warning.

Co-Authored-By: Claude Opus 5 <noreply@anthropic.com>
Claude-Session: https://claude.ai/code/session_01GNbbVsqnhZZujrxG7KqZEw
</commit_message>
<xml_diff>
--- a/docs/Offer-Letter-Oreoluwa-Gbadamosi.docx
+++ b/docs/Offer-Letter-Oreoluwa-Gbadamosi.docx
@@ -89,12 +89,12 @@
           <w:sz w:val="22"/>
           <w:szCs w:val="22"/>
         </w:rPr>
-        <w:t xml:space="preserve">[DATE]</w:t>
-      </w:r>
-    </w:p>
-    <w:p>
-      <w:pPr>
-        <w:spacing w:after="0" w:line="276"/>
+        <w:t xml:space="preserve">26 August 2026</w:t>
+      </w:r>
+    </w:p>
+    <w:p>
+      <w:pPr>
+        <w:spacing w:after="240" w:line="276"/>
       </w:pPr>
       <w:r>
         <w:rPr>
@@ -107,37 +107,11 @@
     </w:p>
     <w:p>
       <w:pPr>
-        <w:spacing w:after="0" w:line="276"/>
-      </w:pPr>
-      <w:r>
-        <w:rPr>
-          <w:rFonts w:ascii="Calibri" w:cs="Calibri" w:eastAsia="Calibri" w:hAnsi="Calibri"/>
-          <w:sz w:val="22"/>
-          <w:szCs w:val="22"/>
-        </w:rPr>
-        <w:t xml:space="preserve">[ADDRESS]</w:t>
-      </w:r>
-    </w:p>
-    <w:p>
-      <w:pPr>
         <w:spacing w:after="240" w:line="276"/>
       </w:pPr>
       <w:r>
         <w:rPr>
           <w:rFonts w:ascii="Calibri" w:cs="Calibri" w:eastAsia="Calibri" w:hAnsi="Calibri"/>
-          <w:sz w:val="22"/>
-          <w:szCs w:val="22"/>
-        </w:rPr>
-        <w:t xml:space="preserve">[EMAIL]</w:t>
-      </w:r>
-    </w:p>
-    <w:p>
-      <w:pPr>
-        <w:spacing w:after="240" w:line="276"/>
-      </w:pPr>
-      <w:r>
-        <w:rPr>
-          <w:rFonts w:ascii="Calibri" w:cs="Calibri" w:eastAsia="Calibri" w:hAnsi="Calibri"/>
           <w:b/>
           <w:bCs/>
           <w:sz w:val="22"/>
@@ -211,7 +185,7 @@
           <w:sz w:val="22"/>
           <w:szCs w:val="22"/>
         </w:rPr>
-        <w:t xml:space="preserve">You will serve as IT Support Engineer, reporting directly to the Chief Technology Officer. Your duties will include [BRIEF SUMMARY OF CORE RESPONSIBILITIES], along with any other responsibilities reasonably assigned to you by the Company from time to time.</w:t>
+        <w:t xml:space="preserve">You will serve as IT Support Engineer, reporting directly to the Chief Technology Officer. Your duties will include providing first- and second-line technical support to the Company’s clients and internal team; logging, triaging and resolving support tickets; setting up, configuring and maintaining user accounts, devices and software; escalating unresolved issues to the engineering team; maintaining support documentation and internal knowledge-base articles; and any other responsibilities reasonably assigned to you by the Chief Technology Officer from time to time.</w:t>
       </w:r>
     </w:p>
     <w:p>
@@ -227,20 +201,20 @@
           <w:sz w:val="22"/>
           <w:szCs w:val="22"/>
         </w:rPr>
-        <w:t xml:space="preserve">2. Start Date</w:t>
-      </w:r>
-    </w:p>
-    <w:p>
-      <w:pPr>
-        <w:spacing w:after="160" w:line="276"/>
-      </w:pPr>
-      <w:r>
-        <w:rPr>
-          <w:rFonts w:ascii="Calibri" w:cs="Calibri" w:eastAsia="Calibri" w:hAnsi="Calibri"/>
-          <w:sz w:val="22"/>
-          <w:szCs w:val="22"/>
-        </w:rPr>
-        <w:t xml:space="preserve">Your engagement will commence on [START DATE], subject to your acceptance of this offer and completion of any onboarding requirements.</w:t>
+        <w:t xml:space="preserve">2. Commencement</w:t>
+      </w:r>
+    </w:p>
+    <w:p>
+      <w:pPr>
+        <w:spacing w:after="160" w:line="276"/>
+      </w:pPr>
+      <w:r>
+        <w:rPr>
+          <w:rFonts w:ascii="Calibri" w:cs="Calibri" w:eastAsia="Calibri" w:hAnsi="Calibri"/>
+          <w:sz w:val="22"/>
+          <w:szCs w:val="22"/>
+        </w:rPr>
+        <w:t xml:space="preserve">Your engagement will commence on the date you sign and return this letter, subject to completion of any onboarding requirements.</w:t>
       </w:r>
     </w:p>
     <w:p>
@@ -269,21 +243,13 @@
           <w:sz w:val="22"/>
           <w:szCs w:val="22"/>
         </w:rPr>
-        <w:t xml:space="preserve">This is a full-time engagement. Your work location is remote.</w:t>
-      </w:r>
-    </w:p>
-    <w:p>
-      <w:pPr>
-        <w:spacing w:after="160" w:line="276"/>
-      </w:pPr>
-      <w:r>
-        <w:rPr>
-          <w:rFonts w:ascii="Calibri" w:cs="Calibri" w:eastAsia="Calibri" w:hAnsi="Calibri"/>
-          <w:sz w:val="22"/>
-          <w:szCs w:val="22"/>
-        </w:rPr>
-        <w:t xml:space="preserve">You are expected to be reachable and responsive during agreed working hours and to participate in the Company’s regular reviews and communication channels. </w:t>
-      </w:r>
+        <w:t xml:space="preserve">This is a full-time engagement. Your work location is remote. The Company does not set fixed daily working hours; you are expected to manage your own time so as to meet the expectations set out in Clause 4, and to be reachable and responsive during normal business hours.</w:t>
+      </w:r>
+    </w:p>
+    <w:p>
+      <w:pPr>
+        <w:spacing w:after="160" w:line="276"/>
+      </w:pPr>
       <w:r>
         <w:rPr>
           <w:rFonts w:ascii="Calibri" w:cs="Calibri" w:eastAsia="Calibri" w:hAnsi="Calibri"/>
@@ -316,91 +282,7 @@
           <w:sz w:val="22"/>
           <w:szCs w:val="22"/>
         </w:rPr>
-        <w:t xml:space="preserve">4. Compensation</w:t>
-      </w:r>
-    </w:p>
-    <w:p>
-      <w:pPr>
-        <w:spacing w:after="160" w:line="276"/>
-      </w:pPr>
-      <w:r>
-        <w:rPr>
-          <w:rFonts w:ascii="Calibri" w:cs="Calibri" w:eastAsia="Calibri" w:hAnsi="Calibri"/>
-          <w:sz w:val="22"/>
-          <w:szCs w:val="22"/>
-        </w:rPr>
-        <w:t xml:space="preserve">This engagement is commission-based. You will not receive a fixed salary. You will be paid a commission of [COMMISSION RATE] on [revenue received by the Company from] clients you introduce and who are onboarded by the Company, payable [WITHIN THIRTY (30) DAYS OF THE COMPANY RECEIVING CLEARED PAYMENT FROM THE CLIENT] and subject to all applicable statutory deductions.</w:t>
-      </w:r>
-    </w:p>
-    <w:p>
-      <w:pPr>
-        <w:spacing w:after="160" w:line="276"/>
-      </w:pPr>
-      <w:r>
-        <w:rPr>
-          <w:rFonts w:ascii="Calibri" w:cs="Calibri" w:eastAsia="Calibri" w:hAnsi="Calibri"/>
-          <w:sz w:val="22"/>
-          <w:szCs w:val="22"/>
-        </w:rPr>
-        <w:t xml:space="preserve">A commission is earned only where the client is introduced by you, is accepted by the Company, and has paid the Company in full. Where a client’s payment is refunded, reversed, or charged back, any commission paid on it is repayable to the Company or may be set off against future commission.</w:t>
-      </w:r>
-    </w:p>
-    <w:p>
-      <w:pPr>
-        <w:spacing w:after="160" w:line="276"/>
-      </w:pPr>
-      <w:r>
-        <w:rPr>
-          <w:rFonts w:ascii="Calibri" w:cs="Calibri" w:eastAsia="Calibri" w:hAnsi="Calibri"/>
-          <w:sz w:val="22"/>
-          <w:szCs w:val="22"/>
-        </w:rPr>
-        <w:t xml:space="preserve">The Company may introduce a fixed salary or revise this commission structure at a later date. Any such change will be agreed in writing between the parties.</w:t>
-      </w:r>
-    </w:p>
-    <w:p>
-      <w:pPr>
-        <w:pStyle w:val="Heading2"/>
-        <w:spacing w:after="100" w:line="276"/>
-      </w:pPr>
-      <w:r>
-        <w:rPr>
-          <w:rFonts w:ascii="Calibri" w:cs="Calibri" w:eastAsia="Calibri" w:hAnsi="Calibri"/>
-          <w:b/>
-          <w:bCs/>
-          <w:sz w:val="22"/>
-          <w:szCs w:val="22"/>
-        </w:rPr>
-        <w:t xml:space="preserve">5. Probationary Period</w:t>
-      </w:r>
-    </w:p>
-    <w:p>
-      <w:pPr>
-        <w:spacing w:after="160" w:line="276"/>
-      </w:pPr>
-      <w:r>
-        <w:rPr>
-          <w:rFonts w:ascii="Calibri" w:cs="Calibri" w:eastAsia="Calibri" w:hAnsi="Calibri"/>
-          <w:sz w:val="22"/>
-          <w:szCs w:val="22"/>
-        </w:rPr>
-        <w:t xml:space="preserve">Your first [THREE (3)] months will be a probationary period. During this period, your performance, availability, and general fit with the team will be assessed. Either party may terminate this engagement during probation by giving [ONE (1) WEEK’S] written notice, or payment in lieu of notice, without assigning any reason.</w:t>
-      </w:r>
-    </w:p>
-    <w:p>
-      <w:pPr>
-        <w:pStyle w:val="Heading2"/>
-        <w:spacing w:after="100" w:line="276"/>
-      </w:pPr>
-      <w:r>
-        <w:rPr>
-          <w:rFonts w:ascii="Calibri" w:cs="Calibri" w:eastAsia="Calibri" w:hAnsi="Calibri"/>
-          <w:b/>
-          <w:bCs/>
-          <w:sz w:val="22"/>
-          <w:szCs w:val="22"/>
-        </w:rPr>
-        <w:t xml:space="preserve">6. Performance Expectations</w:t>
+        <w:t xml:space="preserve">4. Performance Expectations</w:t>
       </w:r>
     </w:p>
     <w:p>
@@ -431,7 +313,7 @@
           <w:sz w:val="22"/>
           <w:szCs w:val="22"/>
         </w:rPr>
-        <w:t xml:space="preserve">Be actively available and responsive during agreed working hours, and communicate promptly if you will be unavailable;</w:t>
+        <w:t xml:space="preserve">Be actively available and responsive during normal business hours, and communicate promptly if you will be unavailable;</w:t>
       </w:r>
     </w:p>
     <w:p>
@@ -534,7 +416,7 @@
           <w:sz w:val="22"/>
           <w:szCs w:val="22"/>
         </w:rPr>
-        <w:t xml:space="preserve">Performance and activity will be reviewed on a [MONTHLY / QUARTERLY] basis.</w:t>
+        <w:t xml:space="preserve">Performance and activity will be reviewed on a monthly basis.</w:t>
       </w:r>
     </w:p>
     <w:p>
@@ -550,43 +432,98 @@
           <w:sz w:val="22"/>
           <w:szCs w:val="22"/>
         </w:rPr>
-        <w:t xml:space="preserve">7. Termination</w:t>
-      </w:r>
-    </w:p>
-    <w:p>
-      <w:pPr>
-        <w:spacing w:after="160" w:line="276"/>
-      </w:pPr>
-      <w:r>
-        <w:rPr>
-          <w:rFonts w:ascii="Calibri" w:cs="Calibri" w:eastAsia="Calibri" w:hAnsi="Calibri"/>
-          <w:b/>
-          <w:bCs/>
-          <w:sz w:val="22"/>
-          <w:szCs w:val="22"/>
-        </w:rPr>
-        <w:t xml:space="preserve">The Company may terminate this engagement where you fail to meet the expectations set out in Clause 6.</w:t>
-      </w:r>
-      <w:r>
-        <w:rPr>
-          <w:rFonts w:ascii="Calibri" w:cs="Calibri" w:eastAsia="Calibri" w:hAnsi="Calibri"/>
-          <w:sz w:val="22"/>
-          <w:szCs w:val="22"/>
-        </w:rPr>
-        <w:t xml:space="preserve"> Without limiting any other right the Company has at law, the Company may terminate this engagement if you fail to meet agreed performance standards or deliverables, if you repeatedly fail to attend the mandatory Monday, Wednesday and Friday online meetings, or if you are persistently inactive, unresponsive, or unavailable during agreed working hours.</w:t>
-      </w:r>
-    </w:p>
-    <w:p>
-      <w:pPr>
-        <w:spacing w:after="160" w:line="276"/>
-      </w:pPr>
-      <w:r>
-        <w:rPr>
-          <w:rFonts w:ascii="Calibri" w:cs="Calibri" w:eastAsia="Calibri" w:hAnsi="Calibri"/>
-          <w:sz w:val="22"/>
-          <w:szCs w:val="22"/>
-        </w:rPr>
-        <w:t xml:space="preserve">Where the Company considers the shortfall capable of correction, it will ordinarily notify you in writing, identify what needs to change, and allow a reasonable period of not less than [FOURTEEN (14)] days for improvement. If the required improvement is not achieved within that period, the Company may terminate the engagement on [ONE (1) WEEK’S] written notice.</w:t>
+        <w:t xml:space="preserve">5. Compensation</w:t>
+      </w:r>
+    </w:p>
+    <w:p>
+      <w:pPr>
+        <w:spacing w:after="160" w:line="276"/>
+      </w:pPr>
+      <w:r>
+        <w:rPr>
+          <w:rFonts w:ascii="Calibri" w:cs="Calibri" w:eastAsia="Calibri" w:hAnsi="Calibri"/>
+          <w:sz w:val="22"/>
+          <w:szCs w:val="22"/>
+        </w:rPr>
+        <w:t xml:space="preserve">This engagement is commission-based. You will not receive a fixed salary. You will be paid a commission on revenue received by the Company from clients you introduce and who are onboarded by the Company. The applicable commission rate and payment schedule will be agreed between the parties in writing separately from this letter, and may be revised by written agreement from time to time.</w:t>
+      </w:r>
+    </w:p>
+    <w:p>
+      <w:pPr>
+        <w:spacing w:after="160" w:line="276"/>
+      </w:pPr>
+      <w:r>
+        <w:rPr>
+          <w:rFonts w:ascii="Calibri" w:cs="Calibri" w:eastAsia="Calibri" w:hAnsi="Calibri"/>
+          <w:sz w:val="22"/>
+          <w:szCs w:val="22"/>
+        </w:rPr>
+        <w:t xml:space="preserve">A commission is earned only where the client is introduced by you, is accepted by the Company, and has paid the Company in full. Where a client’s payment is refunded, reversed, or charged back, any commission paid on it is repayable to the Company or may be set off against future commission. All commission is subject to applicable statutory deductions.</w:t>
+      </w:r>
+    </w:p>
+    <w:p>
+      <w:pPr>
+        <w:spacing w:after="160" w:line="276"/>
+      </w:pPr>
+      <w:r>
+        <w:rPr>
+          <w:rFonts w:ascii="Calibri" w:cs="Calibri" w:eastAsia="Calibri" w:hAnsi="Calibri"/>
+          <w:sz w:val="22"/>
+          <w:szCs w:val="22"/>
+        </w:rPr>
+        <w:t xml:space="preserve">The Company may introduce a fixed salary at a later date. Any such change will be agreed in writing between the parties.</w:t>
+      </w:r>
+    </w:p>
+    <w:p>
+      <w:pPr>
+        <w:pStyle w:val="Heading2"/>
+        <w:spacing w:after="100" w:line="276"/>
+      </w:pPr>
+      <w:r>
+        <w:rPr>
+          <w:rFonts w:ascii="Calibri" w:cs="Calibri" w:eastAsia="Calibri" w:hAnsi="Calibri"/>
+          <w:b/>
+          <w:bCs/>
+          <w:sz w:val="22"/>
+          <w:szCs w:val="22"/>
+        </w:rPr>
+        <w:t xml:space="preserve">6. Termination</w:t>
+      </w:r>
+    </w:p>
+    <w:p>
+      <w:pPr>
+        <w:spacing w:after="160" w:line="276"/>
+      </w:pPr>
+      <w:r>
+        <w:rPr>
+          <w:rFonts w:ascii="Calibri" w:cs="Calibri" w:eastAsia="Calibri" w:hAnsi="Calibri"/>
+          <w:b/>
+          <w:bCs/>
+          <w:sz w:val="22"/>
+          <w:szCs w:val="22"/>
+        </w:rPr>
+        <w:t xml:space="preserve">The Company may terminate this engagement where you fail to meet the expectations set out in Clause 4.</w:t>
+      </w:r>
+      <w:r>
+        <w:rPr>
+          <w:rFonts w:ascii="Calibri" w:cs="Calibri" w:eastAsia="Calibri" w:hAnsi="Calibri"/>
+          <w:sz w:val="22"/>
+          <w:szCs w:val="22"/>
+        </w:rPr>
+        <w:t xml:space="preserve"> Without limiting any other right the Company has at law, the Company may terminate this engagement if you fail to meet agreed performance standards or deliverables, if you repeatedly fail to attend the mandatory Monday, Wednesday and Friday online meetings, or if you are persistently inactive, unresponsive, or unavailable during normal business hours.</w:t>
+      </w:r>
+    </w:p>
+    <w:p>
+      <w:pPr>
+        <w:spacing w:after="160" w:line="276"/>
+      </w:pPr>
+      <w:r>
+        <w:rPr>
+          <w:rFonts w:ascii="Calibri" w:cs="Calibri" w:eastAsia="Calibri" w:hAnsi="Calibri"/>
+          <w:sz w:val="22"/>
+          <w:szCs w:val="22"/>
+        </w:rPr>
+        <w:t xml:space="preserve">Where the Company considers the shortfall capable of correction, it will notify you in writing, identify what needs to change, and allow a period of not less than fourteen (14) days for improvement. If the required improvement is not achieved within that period, the Company may terminate the engagement with immediate effect.</w:t>
       </w:r>
     </w:p>
     <w:p>
@@ -612,7 +549,7 @@
           <w:sz w:val="22"/>
           <w:szCs w:val="22"/>
         </w:rPr>
-        <w:t xml:space="preserve">Outside of the circumstances above, either party may terminate this engagement by giving [ONE (1) MONTH’S] written notice, or payment in lieu of notice, after the probationary period has ended. On termination, commission remains payable on clients introduced by you who had already paid the Company in full before the termination date; no commission accrues on payments received after that date.</w:t>
+        <w:t xml:space="preserve">Outside of the circumstances above, either party may terminate this engagement by giving two (2) weeks’ written notice. On termination, commission remains payable on clients introduced by you who had already paid the Company in full before the termination date; no commission accrues on payments received after that date.</w:t>
       </w:r>
     </w:p>
     <w:p>
@@ -628,7 +565,7 @@
           <w:sz w:val="22"/>
           <w:szCs w:val="22"/>
         </w:rPr>
-        <w:t xml:space="preserve">8. Confidentiality and Intellectual Property</w:t>
+        <w:t xml:space="preserve">7. Confidentiality and Intellectual Property</w:t>
       </w:r>
     </w:p>
     <w:p>
@@ -657,7 +594,7 @@
           <w:sz w:val="22"/>
           <w:szCs w:val="22"/>
         </w:rPr>
-        <w:t xml:space="preserve">9. Governing Law</w:t>
+        <w:t xml:space="preserve">8. Governing Law</w:t>
       </w:r>
     </w:p>
     <w:p>
@@ -686,7 +623,7 @@
           <w:sz w:val="22"/>
           <w:szCs w:val="22"/>
         </w:rPr>
-        <w:t xml:space="preserve">10. Entire Agreement</w:t>
+        <w:t xml:space="preserve">9. Entire Agreement</w:t>
       </w:r>
     </w:p>
     <w:p>
@@ -712,7 +649,7 @@
           <w:sz w:val="22"/>
           <w:szCs w:val="22"/>
         </w:rPr>
-        <w:t xml:space="preserve">If these terms are acceptable to you, please sign and return a copy of this letter by [ACCEPTANCE DEADLINE]. We look forward to welcoming you to the team.</w:t>
+        <w:t xml:space="preserve">If these terms are acceptable to you, please sign and return a copy of this letter. We look forward to welcoming you to the team.</w:t>
       </w:r>
     </w:p>
     <w:p>

</xml_diff>

<commit_message>
Add signature and signing block to offer letter
Embeds the CTO signature above the signature rule and gives the
acceptance block labelled signature and date lines with room to sign.

Co-Authored-By: Claude Opus 5 <noreply@anthropic.com>
Claude-Session: https://claude.ai/code/session_01GNbbVsqnhZZujrxG7KqZEw
</commit_message>
<xml_diff>
--- a/docs/Offer-Letter-Oreoluwa-Gbadamosi.docx
+++ b/docs/Offer-Letter-Oreoluwa-Gbadamosi.docx
@@ -654,6 +654,140 @@
     </w:p>
     <w:p>
       <w:pPr>
+        <w:spacing w:after="120" w:line="276"/>
+      </w:pPr>
+      <w:r>
+        <w:rPr>
+          <w:rFonts w:ascii="Calibri" w:cs="Calibri" w:eastAsia="Calibri" w:hAnsi="Calibri"/>
+          <w:sz w:val="22"/>
+          <w:szCs w:val="22"/>
+        </w:rPr>
+        <w:t xml:space="preserve">Yours sincerely,</w:t>
+      </w:r>
+    </w:p>
+    <w:p>
+      <w:pPr>
+        <w:pBdr>
+          <w:bottom w:val="single" w:color="000000" w:sz="6" w:space="4"/>
+        </w:pBdr>
+        <w:spacing w:after="0"/>
+        <w:ind w:right="5184"/>
+      </w:pPr>
+      <w:r>
+        <w:drawing>
+          <wp:inline distT="0" distB="0" distL="0" distR="0">
+            <wp:extent cx="1809750" cy="295275"/>
+            <wp:effectExtent t="0" r="0" b="0" l="0"/>
+            <wp:docPr id="1" name="" descr="" title=""/>
+            <wp:cNvGraphicFramePr>
+              <a:graphicFrameLocks xmlns:a="http://schemas.openxmlformats.org/drawingml/2006/main" noChangeAspect="1"/>
+            </wp:cNvGraphicFramePr>
+            <a:graphic xmlns:a="http://schemas.openxmlformats.org/drawingml/2006/main">
+              <a:graphicData uri="http://schemas.openxmlformats.org/drawingml/2006/picture">
+                <pic:pic xmlns:pic="http://schemas.openxmlformats.org/drawingml/2006/picture">
+                  <pic:nvPicPr>
+                    <pic:cNvPr id="0" name="" descr=""/>
+                    <pic:cNvPicPr>
+                      <a:picLocks noChangeAspect="1" noChangeArrowheads="1"/>
+                    </pic:cNvPicPr>
+                  </pic:nvPicPr>
+                  <pic:blipFill>
+                    <a:blip r:embed="rId8" cstate="none"/>
+                    <a:srcRect/>
+                    <a:stretch>
+                      <a:fillRect/>
+                    </a:stretch>
+                  </pic:blipFill>
+                  <pic:spPr bwMode="auto">
+                    <a:xfrm>
+                      <a:off x="0" y="0"/>
+                      <a:ext cx="1809750" cy="295275"/>
+                    </a:xfrm>
+                    <a:prstGeom prst="rect">
+                      <a:avLst/>
+                    </a:prstGeom>
+                  </pic:spPr>
+                </pic:pic>
+              </a:graphicData>
+            </a:graphic>
+          </wp:inline>
+        </w:drawing>
+      </w:r>
+    </w:p>
+    <w:p>
+      <w:pPr>
+        <w:spacing w:after="0" w:line="276"/>
+      </w:pPr>
+      <w:r>
+        <w:rPr>
+          <w:rFonts w:ascii="Calibri" w:cs="Calibri" w:eastAsia="Calibri" w:hAnsi="Calibri"/>
+          <w:b/>
+          <w:bCs/>
+          <w:sz w:val="22"/>
+          <w:szCs w:val="22"/>
+        </w:rPr>
+        <w:t xml:space="preserve">Adeseko Samuel</w:t>
+      </w:r>
+    </w:p>
+    <w:p>
+      <w:pPr>
+        <w:spacing w:after="0" w:line="276"/>
+      </w:pPr>
+      <w:r>
+        <w:rPr>
+          <w:rFonts w:ascii="Calibri" w:cs="Calibri" w:eastAsia="Calibri" w:hAnsi="Calibri"/>
+          <w:sz w:val="22"/>
+          <w:szCs w:val="22"/>
+        </w:rPr>
+        <w:t xml:space="preserve">Chief Technology Officer &amp; Co-Founder</w:t>
+      </w:r>
+    </w:p>
+    <w:p>
+      <w:pPr>
+        <w:spacing w:after="400" w:line="276"/>
+      </w:pPr>
+      <w:r>
+        <w:rPr>
+          <w:rFonts w:ascii="Calibri" w:cs="Calibri" w:eastAsia="Calibri" w:hAnsi="Calibri"/>
+          <w:sz w:val="22"/>
+          <w:szCs w:val="22"/>
+        </w:rPr>
+        <w:t xml:space="preserve">Folub &amp; Samuel Labs</w:t>
+      </w:r>
+    </w:p>
+    <w:p>
+      <w:pPr>
+        <w:pBdr>
+          <w:bottom w:val="single" w:color="BFBFBF" w:sz="6" w:space="1"/>
+        </w:pBdr>
+        <w:spacing w:after="0" w:line="276"/>
+      </w:pPr>
+      <w:r>
+        <w:rPr>
+          <w:rFonts w:ascii="Calibri" w:cs="Calibri" w:eastAsia="Calibri" w:hAnsi="Calibri"/>
+          <w:sz w:val="22"/>
+          <w:szCs w:val="22"/>
+        </w:rPr>
+        <w:t xml:space="preserve"/>
+      </w:r>
+    </w:p>
+    <w:p>
+      <w:pPr>
+        <w:spacing w:after="100" w:line="276"/>
+      </w:pPr>
+      <w:r>
+        <w:rPr>
+          <w:rFonts w:ascii="Calibri" w:cs="Calibri" w:eastAsia="Calibri" w:hAnsi="Calibri"/>
+          <w:b/>
+          <w:bCs/>
+          <w:sz w:val="22"/>
+          <w:szCs w:val="22"/>
+        </w:rPr>
+        <w:t xml:space="preserve">Acceptance</w:t>
+      </w:r>
+    </w:p>
+    <w:p>
+      <w:pPr>
         <w:spacing w:after="560" w:line="276"/>
       </w:pPr>
       <w:r>
@@ -662,7 +796,7 @@
           <w:sz w:val="22"/>
           <w:szCs w:val="22"/>
         </w:rPr>
-        <w:t xml:space="preserve">Yours sincerely,</w:t>
+        <w:t xml:space="preserve">I, Oreoluwa Gbadamosi, have read, understood, and accept the terms of this offer of engagement.</w:t>
       </w:r>
     </w:p>
     <w:p>
@@ -684,87 +818,15 @@
     </w:p>
     <w:p>
       <w:pPr>
-        <w:spacing w:after="0" w:line="276"/>
-      </w:pPr>
-      <w:r>
-        <w:rPr>
-          <w:rFonts w:ascii="Calibri" w:cs="Calibri" w:eastAsia="Calibri" w:hAnsi="Calibri"/>
-          <w:b/>
-          <w:bCs/>
-          <w:sz w:val="22"/>
-          <w:szCs w:val="22"/>
-        </w:rPr>
-        <w:t xml:space="preserve">Adeseko Samuel</w:t>
-      </w:r>
-    </w:p>
-    <w:p>
-      <w:pPr>
-        <w:spacing w:after="0" w:line="276"/>
-      </w:pPr>
-      <w:r>
-        <w:rPr>
-          <w:rFonts w:ascii="Calibri" w:cs="Calibri" w:eastAsia="Calibri" w:hAnsi="Calibri"/>
-          <w:sz w:val="22"/>
-          <w:szCs w:val="22"/>
-        </w:rPr>
-        <w:t xml:space="preserve">Chief Technology Officer &amp; Co-Founder</w:t>
-      </w:r>
-    </w:p>
-    <w:p>
-      <w:pPr>
-        <w:spacing w:after="400" w:line="276"/>
-      </w:pPr>
-      <w:r>
-        <w:rPr>
-          <w:rFonts w:ascii="Calibri" w:cs="Calibri" w:eastAsia="Calibri" w:hAnsi="Calibri"/>
-          <w:sz w:val="22"/>
-          <w:szCs w:val="22"/>
-        </w:rPr>
-        <w:t xml:space="preserve">Folub &amp; Samuel Labs</w:t>
-      </w:r>
-    </w:p>
-    <w:p>
-      <w:pPr>
-        <w:pBdr>
-          <w:bottom w:val="single" w:color="BFBFBF" w:sz="6" w:space="1"/>
-        </w:pBdr>
-        <w:spacing w:after="0" w:line="276"/>
-      </w:pPr>
-      <w:r>
-        <w:rPr>
-          <w:rFonts w:ascii="Calibri" w:cs="Calibri" w:eastAsia="Calibri" w:hAnsi="Calibri"/>
-          <w:sz w:val="22"/>
-          <w:szCs w:val="22"/>
-        </w:rPr>
-        <w:t xml:space="preserve"/>
-      </w:r>
-    </w:p>
-    <w:p>
-      <w:pPr>
-        <w:spacing w:after="100" w:line="276"/>
-      </w:pPr>
-      <w:r>
-        <w:rPr>
-          <w:rFonts w:ascii="Calibri" w:cs="Calibri" w:eastAsia="Calibri" w:hAnsi="Calibri"/>
-          <w:b/>
-          <w:bCs/>
-          <w:sz w:val="22"/>
-          <w:szCs w:val="22"/>
-        </w:rPr>
-        <w:t xml:space="preserve">Acceptance</w:t>
-      </w:r>
-    </w:p>
-    <w:p>
-      <w:pPr>
-        <w:spacing w:after="460" w:line="276"/>
-      </w:pPr>
-      <w:r>
-        <w:rPr>
-          <w:rFonts w:ascii="Calibri" w:cs="Calibri" w:eastAsia="Calibri" w:hAnsi="Calibri"/>
-          <w:sz w:val="22"/>
-          <w:szCs w:val="22"/>
-        </w:rPr>
-        <w:t xml:space="preserve">I, Oreoluwa Gbadamosi, have read, understood, and accept the terms of this offer of engagement.</w:t>
+        <w:spacing w:after="520" w:line="276"/>
+      </w:pPr>
+      <w:r>
+        <w:rPr>
+          <w:rFonts w:ascii="Calibri" w:cs="Calibri" w:eastAsia="Calibri" w:hAnsi="Calibri"/>
+          <w:sz w:val="22"/>
+          <w:szCs w:val="22"/>
+        </w:rPr>
+        <w:t xml:space="preserve">Signature — Oreoluwa Gbadamosi</w:t>
       </w:r>
     </w:p>
     <w:p>
@@ -773,37 +835,7 @@
           <w:bottom w:val="single" w:color="000000" w:sz="6" w:space="1"/>
         </w:pBdr>
         <w:spacing w:after="0" w:line="276"/>
-        <w:ind w:right="5184"/>
-      </w:pPr>
-      <w:r>
-        <w:rPr>
-          <w:rFonts w:ascii="Calibri" w:cs="Calibri" w:eastAsia="Calibri" w:hAnsi="Calibri"/>
-          <w:sz w:val="22"/>
-          <w:szCs w:val="22"/>
-        </w:rPr>
-        <w:t xml:space="preserve"/>
-      </w:r>
-    </w:p>
-    <w:p>
-      <w:pPr>
-        <w:spacing w:after="340" w:line="276"/>
-      </w:pPr>
-      <w:r>
-        <w:rPr>
-          <w:rFonts w:ascii="Calibri" w:cs="Calibri" w:eastAsia="Calibri" w:hAnsi="Calibri"/>
-          <w:sz w:val="22"/>
-          <w:szCs w:val="22"/>
-        </w:rPr>
-        <w:t xml:space="preserve">Oreoluwa Gbadamosi</w:t>
-      </w:r>
-    </w:p>
-    <w:p>
-      <w:pPr>
-        <w:pBdr>
-          <w:bottom w:val="single" w:color="000000" w:sz="6" w:space="1"/>
-        </w:pBdr>
-        <w:spacing w:after="0" w:line="276"/>
-        <w:ind w:right="6624"/>
+        <w:ind w:right="6911"/>
       </w:pPr>
       <w:r>
         <w:rPr>

</xml_diff>